<commit_message>
Report: author details, qualitative results figure, metadata
</commit_message>
<xml_diff>
--- a/Multimodal_Product_Recommendation_IEEE_Report.docx
+++ b/Multimodal_Product_Recommendation_IEEE_Report.docx
@@ -55,7 +55,7 @@
                 <w:sz w:val="22"/>
                 <w:szCs w:val="22"/>
               </w:rPr>
-              <w:t xml:space="preserve">[Student Name]</w:t>
+              <w:t xml:space="preserve">Ananya</w:t>
             </w:r>
           </w:p>
           <w:p>
@@ -70,7 +70,7 @@
                 <w:sz w:val="20"/>
                 <w:szCs w:val="20"/>
               </w:rPr>
-              <w:t xml:space="preserve">Dept. of [Department]</w:t>
+              <w:t xml:space="preserve">School of Computer Applications</w:t>
             </w:r>
           </w:p>
           <w:p>
@@ -85,7 +85,7 @@
                 <w:sz w:val="20"/>
                 <w:szCs w:val="20"/>
               </w:rPr>
-              <w:t xml:space="preserve">[College / University Name]</w:t>
+              <w:t xml:space="preserve">Dayananda Sagar University</w:t>
             </w:r>
           </w:p>
           <w:p>
@@ -100,7 +100,7 @@
                 <w:sz w:val="20"/>
                 <w:szCs w:val="20"/>
               </w:rPr>
-              <w:t xml:space="preserve">[City], India</w:t>
+              <w:t xml:space="preserve">Bengaluru, India</w:t>
             </w:r>
           </w:p>
           <w:p>
@@ -115,7 +115,7 @@
                 <w:sz w:val="20"/>
                 <w:szCs w:val="20"/>
               </w:rPr>
-              <w:t xml:space="preserve">[email address]</w:t>
+              <w:t xml:space="preserve">SCA25MSD011@dsu.edu.in</w:t>
             </w:r>
           </w:p>
         </w:tc>
@@ -141,7 +141,7 @@
                 <w:sz w:val="22"/>
                 <w:szCs w:val="22"/>
               </w:rPr>
-              <w:t xml:space="preserve">[Guide Name]</w:t>
+              <w:t xml:space="preserve">Ms. Priyanka Rukesh</w:t>
             </w:r>
           </w:p>
           <w:p>
@@ -156,7 +156,7 @@
                 <w:sz w:val="20"/>
                 <w:szCs w:val="20"/>
               </w:rPr>
-              <w:t xml:space="preserve">Dept. of [Department]</w:t>
+              <w:t xml:space="preserve">School of Computer Applications</w:t>
             </w:r>
           </w:p>
           <w:p>
@@ -171,7 +171,7 @@
                 <w:sz w:val="20"/>
                 <w:szCs w:val="20"/>
               </w:rPr>
-              <w:t xml:space="preserve">[College / University Name]</w:t>
+              <w:t xml:space="preserve">Dayananda Sagar University</w:t>
             </w:r>
           </w:p>
           <w:p>
@@ -186,22 +186,7 @@
                 <w:sz w:val="20"/>
                 <w:szCs w:val="20"/>
               </w:rPr>
-              <w:t xml:space="preserve">[City], India</w:t>
-            </w:r>
-          </w:p>
-          <w:p>
-            <w:pPr>
-              <w:jc w:val="center"/>
-            </w:pPr>
-            <w:r>
-              <w:rPr>
-                <w:rFonts w:ascii="Times New Roman" w:cs="Times New Roman" w:eastAsia="Times New Roman" w:hAnsi="Times New Roman"/>
-                <w:i w:val="false"/>
-                <w:iCs w:val="false"/>
-                <w:sz w:val="20"/>
-                <w:szCs w:val="20"/>
-              </w:rPr>
-              <w:t xml:space="preserve">[email address]</w:t>
+              <w:t xml:space="preserve">Bengaluru, India</w:t>
             </w:r>
           </w:p>
         </w:tc>
@@ -15021,7 +15006,83 @@
           <w:sz w:val="20"/>
           <w:szCs w:val="20"/>
         </w:rPr>
-        <w:t xml:space="preserve">The final model is deployed in a Streamlit web application that answers similar-product, text, photo and photo + text queries on the 6,602 unseen products in real time on a laptop CPU, since the model has only 3.8 M parameters. As a complementary experiment, a conditional DCGAN [30] trained from scratch with DiffAugment [31] generates new 64×64 product images per category; after fixing an initial mode collapse, its Fréchet distance in CLIP feature space improved from 0.72 (untrained generator) to 0.50, and 14% of generated images are recognised as the requested category (chance 7%). Image quality remains limited by the small CPU training budget.</w:t>
+        <w:t xml:space="preserve">The final model is deployed in a Streamlit web application that answers similar-product, text, photo and photo + text queries on the 6,602 unseen products in real time on a laptop CPU, since the model has only 3.8 M parameters. Fig. 5 shows typical results: a text query returns black handbags, a photo of a black watch returns other black watches, adding the words “white watch” to the same photo keeps the product type but changes the colour, and a purple T-shirt retrieves other purple T-shirts.</w:t>
+      </w:r>
+    </w:p>
+    <w:p>
+      <w:pPr>
+        <w:keepNext/>
+        <w:spacing w:before="120"/>
+        <w:jc w:val="center"/>
+      </w:pPr>
+      <w:r>
+        <w:drawing>
+          <wp:inline distT="0" distB="0" distL="0" distR="0">
+            <wp:extent cx="3152775" cy="2714625"/>
+            <wp:effectExtent t="0" r="0" b="0" l="0"/>
+            <wp:docPr id="1" name="" descr="" title=""/>
+            <wp:cNvGraphicFramePr>
+              <a:graphicFrameLocks xmlns:a="http://schemas.openxmlformats.org/drawingml/2006/main" noChangeAspect="1"/>
+            </wp:cNvGraphicFramePr>
+            <a:graphic xmlns:a="http://schemas.openxmlformats.org/drawingml/2006/main">
+              <a:graphicData uri="http://schemas.openxmlformats.org/drawingml/2006/picture">
+                <pic:pic xmlns:pic="http://schemas.openxmlformats.org/drawingml/2006/picture">
+                  <pic:nvPicPr>
+                    <pic:cNvPr id="0" name="" descr=""/>
+                    <pic:cNvPicPr>
+                      <a:picLocks noChangeAspect="1" noChangeArrowheads="1"/>
+                    </pic:cNvPicPr>
+                  </pic:nvPicPr>
+                  <pic:blipFill>
+                    <a:blip r:embed="rId11" cstate="none"/>
+                    <a:srcRect/>
+                    <a:stretch>
+                      <a:fillRect/>
+                    </a:stretch>
+                  </pic:blipFill>
+                  <pic:spPr bwMode="auto">
+                    <a:xfrm>
+                      <a:off x="0" y="0"/>
+                      <a:ext cx="3152775" cy="2714625"/>
+                    </a:xfrm>
+                    <a:prstGeom prst="rect">
+                      <a:avLst/>
+                    </a:prstGeom>
+                  </pic:spPr>
+                </pic:pic>
+              </a:graphicData>
+            </a:graphic>
+          </wp:inline>
+        </w:drawing>
+      </w:r>
+    </w:p>
+    <w:p>
+      <w:pPr>
+        <w:spacing w:after="140"/>
+        <w:jc w:val="both"/>
+      </w:pPr>
+      <w:r>
+        <w:rPr>
+          <w:rFonts w:ascii="Times New Roman" w:cs="Times New Roman" w:eastAsia="Times New Roman" w:hAnsi="Times New Roman"/>
+          <w:sz w:val="16"/>
+          <w:szCs w:val="16"/>
+        </w:rPr>
+        <w:t xml:space="preserve">Fig. 5. Top-5 recommendations of the final model for a text query, a photo query, a photo + text query and a similar-product query (products not seen in training).</w:t>
+      </w:r>
+    </w:p>
+    <w:p>
+      <w:pPr>
+        <w:spacing w:after="0" w:line="228"/>
+        <w:ind w:firstLine="202"/>
+        <w:jc w:val="both"/>
+      </w:pPr>
+      <w:r>
+        <w:rPr>
+          <w:rFonts w:ascii="Times New Roman" w:cs="Times New Roman" w:eastAsia="Times New Roman" w:hAnsi="Times New Roman"/>
+          <w:sz w:val="20"/>
+          <w:szCs w:val="20"/>
+        </w:rPr>
+        <w:t xml:space="preserve">As a complementary experiment, a conditional DCGAN [30] trained from scratch with DiffAugment [31] generates new 64×64 product images per category; after fixing an initial mode collapse, its Fréchet distance in CLIP feature space improved from 0.72 (untrained generator) to 0.50, and 14% of generated images are recognised as the requested category (chance 7%). Image quality remains limited by the small CPU training budget.</w:t>
       </w:r>
     </w:p>
     <w:p>

</xml_diff>

<commit_message>
Report: remove '(ours)' labels from tables
</commit_message>
<xml_diff>
--- a/Multimodal_Product_Recommendation_IEEE_Report.docx
+++ b/Multimodal_Product_Recommendation_IEEE_Report.docx
@@ -9705,7 +9705,7 @@
                 <w:sz w:val="13"/>
                 <w:szCs w:val="13"/>
               </w:rPr>
-              <w:t xml:space="preserve">Gated + uni-modal (ours)</w:t>
+              <w:t xml:space="preserve">Gated + uni-modal</w:t>
             </w:r>
           </w:p>
         </w:tc>
@@ -14436,7 +14436,7 @@
                 <w:sz w:val="13"/>
                 <w:szCs w:val="13"/>
               </w:rPr>
-              <w:t xml:space="preserve">Gated + uni (ours)</w:t>
+              <w:t xml:space="preserve">Gated + uni-modal</w:t>
             </w:r>
           </w:p>
         </w:tc>
@@ -14686,7 +14686,7 @@
                 <w:sz w:val="13"/>
                 <w:szCs w:val="13"/>
               </w:rPr>
-              <w:t xml:space="preserve">+ noise-aware (ours)</w:t>
+              <w:t xml:space="preserve">Gated + noise-aware + uni-modal</w:t>
             </w:r>
           </w:p>
         </w:tc>

</xml_diff>